<commit_message>
Full Rebuild Chukas 5785
</commit_message>
<xml_diff>
--- a/Files/04 - Bamidbar/06 - Chukas/5785/Chukas 5785.docx
+++ b/Files/04 - Bamidbar/06 - Chukas/5785/Chukas 5785.docx
@@ -1109,7 +1109,7 @@
           <w:rFonts w:ascii="Times New Roman" w:hAnsi="Times New Roman" w:cs="Times New Roman"/>
           <w:rtl/>
         </w:rPr>
-        <w:t>"</w:t>
+        <w:t>״</w:t>
       </w:r>
       <w:r>
         <w:rPr>
@@ -1160,7 +1160,7 @@
           <w:rFonts w:ascii="Times New Roman" w:hAnsi="Times New Roman" w:cs="Times New Roman"/>
           <w:rtl/>
         </w:rPr>
-        <w:t>"</w:t>
+        <w:t>״</w:t>
       </w:r>
       <w:r>
         <w:rPr>
@@ -1238,7 +1238,7 @@
           <w:rFonts w:ascii="Times New Roman" w:hAnsi="Times New Roman" w:cs="Times New Roman"/>
           <w:rtl/>
         </w:rPr>
-        <w:t>"</w:t>
+        <w:t>״</w:t>
       </w:r>
       <w:r>
         <w:rPr>
@@ -1307,7 +1307,7 @@
           <w:rFonts w:ascii="Times New Roman" w:hAnsi="Times New Roman" w:cs="Times New Roman"/>
           <w:rtl/>
         </w:rPr>
-        <w:t>"</w:t>
+        <w:t>״</w:t>
       </w:r>
       <w:r>
         <w:rPr>
@@ -1371,7 +1371,7 @@
           <w:rFonts w:ascii="Times New Roman" w:hAnsi="Times New Roman" w:cs="Times New Roman"/>
           <w:rtl/>
         </w:rPr>
-        <w:t>"</w:t>
+        <w:t>״</w:t>
       </w:r>
       <w:r>
         <w:rPr>
@@ -1709,7 +1709,7 @@
           <w:rFonts w:ascii="Times New Roman" w:hAnsi="Times New Roman" w:cs="Times New Roman"/>
           <w:rtl/>
         </w:rPr>
-        <w:t>"</w:t>
+        <w:t>״</w:t>
       </w:r>
       <w:r>
         <w:rPr>
@@ -1991,7 +1991,7 @@
           <w:rFonts w:ascii="Times New Roman" w:hAnsi="Times New Roman" w:cs="Times New Roman"/>
           <w:rtl/>
         </w:rPr>
-        <w:t>"</w:t>
+        <w:t>״</w:t>
       </w:r>
       <w:r>
         <w:rPr>
@@ -2043,7 +2043,7 @@
           <w:rFonts w:ascii="Times New Roman" w:hAnsi="Times New Roman" w:cs="Times New Roman"/>
           <w:rtl/>
         </w:rPr>
-        <w:t>"</w:t>
+        <w:t>״</w:t>
       </w:r>
       <w:r>
         <w:rPr>
@@ -3378,7 +3378,7 @@
         <w:rPr>
           <w:rFonts w:ascii="Times New Roman" w:hAnsi="Times New Roman" w:cs="Times New Roman"/>
         </w:rPr>
-        <w:t>. No one ever said Hashem caused them pain, because they recognized</w:t>
+        <w:t xml:space="preserve">. No one ever said Hashem caused them pain, because they recognized </w:t>
       </w:r>
       <w:r>
         <w:rPr>
@@ -4051,7 +4051,7 @@
         <w:rPr>
           <w:rFonts w:ascii="Times New Roman" w:hAnsi="Times New Roman" w:cs="Times New Roman"/>
         </w:rPr>
-        <w:t xml:space="preserve"> into</w:t>
+        <w:t xml:space="preserve"> into </w:t>
       </w:r>
       <w:r>
         <w:rPr>

</xml_diff>